<commit_message>
correctif ex cours 5 et 6
</commit_message>
<xml_diff>
--- a/cours-05-domaine/cours05-devoir-installation-vm-debian.docx
+++ b/cours-05-domaine/cours05-devoir-installation-vm-debian.docx
@@ -12,7 +12,7 @@
       <w:hyperlink r:id="rId4" w:history="1">
         <w:r>
           <w:rPr>
-            <w:rStyle w:val="Hyperlink"/>
+            <w:rStyle w:val="Lienhypertexte"/>
             <w:sz w:val="22"/>
             <w:szCs w:val="22"/>
           </w:rPr>
@@ -20,7 +20,7 @@
         </w:r>
         <w:r>
           <w:rPr>
-            <w:rStyle w:val="Hyperlink"/>
+            <w:rStyle w:val="Lienhypertexte"/>
             <w:sz w:val="22"/>
             <w:szCs w:val="22"/>
           </w:rPr>
@@ -917,11 +917,11 @@
       <w:rFonts w:ascii="Roboto Light" w:hAnsi="Roboto Light"/>
     </w:rPr>
   </w:style>
-  <w:style w:type="paragraph" w:styleId="Heading1">
+  <w:style w:type="paragraph" w:styleId="Titre1">
     <w:name w:val="heading 1"/>
     <w:basedOn w:val="Normal"/>
     <w:next w:val="Normal"/>
-    <w:link w:val="Heading1Char"/>
+    <w:link w:val="Titre1Car"/>
     <w:uiPriority w:val="9"/>
     <w:qFormat/>
     <w:rsid w:val="003B67C5"/>
@@ -938,11 +938,11 @@
       <w:szCs w:val="40"/>
     </w:rPr>
   </w:style>
-  <w:style w:type="paragraph" w:styleId="Heading2">
+  <w:style w:type="paragraph" w:styleId="Titre2">
     <w:name w:val="heading 2"/>
     <w:basedOn w:val="Normal"/>
     <w:next w:val="Normal"/>
-    <w:link w:val="Heading2Char"/>
+    <w:link w:val="Titre2Car"/>
     <w:uiPriority w:val="9"/>
     <w:semiHidden/>
     <w:unhideWhenUsed/>
@@ -961,11 +961,11 @@
       <w:szCs w:val="32"/>
     </w:rPr>
   </w:style>
-  <w:style w:type="paragraph" w:styleId="Heading3">
+  <w:style w:type="paragraph" w:styleId="Titre3">
     <w:name w:val="heading 3"/>
     <w:basedOn w:val="Normal"/>
     <w:next w:val="Normal"/>
-    <w:link w:val="Heading3Char"/>
+    <w:link w:val="Titre3Car"/>
     <w:uiPriority w:val="9"/>
     <w:semiHidden/>
     <w:unhideWhenUsed/>
@@ -984,11 +984,11 @@
       <w:szCs w:val="28"/>
     </w:rPr>
   </w:style>
-  <w:style w:type="paragraph" w:styleId="Heading4">
+  <w:style w:type="paragraph" w:styleId="Titre4">
     <w:name w:val="heading 4"/>
     <w:basedOn w:val="Normal"/>
     <w:next w:val="Normal"/>
-    <w:link w:val="Heading4Char"/>
+    <w:link w:val="Titre4Car"/>
     <w:uiPriority w:val="9"/>
     <w:semiHidden/>
     <w:unhideWhenUsed/>
@@ -1007,11 +1007,11 @@
       <w:color w:val="0F4761" w:themeColor="accent1" w:themeShade="BF"/>
     </w:rPr>
   </w:style>
-  <w:style w:type="paragraph" w:styleId="Heading5">
+  <w:style w:type="paragraph" w:styleId="Titre5">
     <w:name w:val="heading 5"/>
     <w:basedOn w:val="Normal"/>
     <w:next w:val="Normal"/>
-    <w:link w:val="Heading5Char"/>
+    <w:link w:val="Titre5Car"/>
     <w:uiPriority w:val="9"/>
     <w:semiHidden/>
     <w:unhideWhenUsed/>
@@ -1028,11 +1028,11 @@
       <w:color w:val="0F4761" w:themeColor="accent1" w:themeShade="BF"/>
     </w:rPr>
   </w:style>
-  <w:style w:type="paragraph" w:styleId="Heading6">
+  <w:style w:type="paragraph" w:styleId="Titre6">
     <w:name w:val="heading 6"/>
     <w:basedOn w:val="Normal"/>
     <w:next w:val="Normal"/>
-    <w:link w:val="Heading6Char"/>
+    <w:link w:val="Titre6Car"/>
     <w:uiPriority w:val="9"/>
     <w:semiHidden/>
     <w:unhideWhenUsed/>
@@ -1051,11 +1051,11 @@
       <w:color w:val="595959" w:themeColor="text1" w:themeTint="A6"/>
     </w:rPr>
   </w:style>
-  <w:style w:type="paragraph" w:styleId="Heading7">
+  <w:style w:type="paragraph" w:styleId="Titre7">
     <w:name w:val="heading 7"/>
     <w:basedOn w:val="Normal"/>
     <w:next w:val="Normal"/>
-    <w:link w:val="Heading7Char"/>
+    <w:link w:val="Titre7Car"/>
     <w:uiPriority w:val="9"/>
     <w:semiHidden/>
     <w:unhideWhenUsed/>
@@ -1072,11 +1072,11 @@
       <w:color w:val="595959" w:themeColor="text1" w:themeTint="A6"/>
     </w:rPr>
   </w:style>
-  <w:style w:type="paragraph" w:styleId="Heading8">
+  <w:style w:type="paragraph" w:styleId="Titre8">
     <w:name w:val="heading 8"/>
     <w:basedOn w:val="Normal"/>
     <w:next w:val="Normal"/>
-    <w:link w:val="Heading8Char"/>
+    <w:link w:val="Titre8Car"/>
     <w:uiPriority w:val="9"/>
     <w:semiHidden/>
     <w:unhideWhenUsed/>
@@ -1095,11 +1095,11 @@
       <w:color w:val="272727" w:themeColor="text1" w:themeTint="D8"/>
     </w:rPr>
   </w:style>
-  <w:style w:type="paragraph" w:styleId="Heading9">
+  <w:style w:type="paragraph" w:styleId="Titre9">
     <w:name w:val="heading 9"/>
     <w:basedOn w:val="Normal"/>
     <w:next w:val="Normal"/>
-    <w:link w:val="Heading9Char"/>
+    <w:link w:val="Titre9Car"/>
     <w:uiPriority w:val="9"/>
     <w:semiHidden/>
     <w:unhideWhenUsed/>
@@ -1116,13 +1116,13 @@
       <w:color w:val="272727" w:themeColor="text1" w:themeTint="D8"/>
     </w:rPr>
   </w:style>
-  <w:style w:type="character" w:default="1" w:styleId="DefaultParagraphFont">
+  <w:style w:type="character" w:default="1" w:styleId="Policepardfaut">
     <w:name w:val="Default Paragraph Font"/>
     <w:uiPriority w:val="1"/>
     <w:semiHidden/>
     <w:unhideWhenUsed/>
   </w:style>
-  <w:style w:type="table" w:default="1" w:styleId="TableNormal">
+  <w:style w:type="table" w:default="1" w:styleId="TableauNormal">
     <w:name w:val="Normal Table"/>
     <w:uiPriority w:val="99"/>
     <w:semiHidden/>
@@ -1137,7 +1137,7 @@
       </w:tblCellMar>
     </w:tblPr>
   </w:style>
-  <w:style w:type="numbering" w:default="1" w:styleId="NoList">
+  <w:style w:type="numbering" w:default="1" w:styleId="Aucuneliste">
     <w:name w:val="No List"/>
     <w:uiPriority w:val="99"/>
     <w:semiHidden/>
@@ -1167,7 +1167,7 @@
   </w:style>
   <w:style w:type="character" w:customStyle="1" w:styleId="DevoirTitreSectionCar">
     <w:name w:val="DevoirTitreSection Car"/>
-    <w:basedOn w:val="DefaultParagraphFont"/>
+    <w:basedOn w:val="Policepardfaut"/>
     <w:link w:val="DevoirTitreSection"/>
     <w:rsid w:val="00390E7D"/>
     <w:rPr>
@@ -1197,7 +1197,7 @@
   </w:style>
   <w:style w:type="character" w:customStyle="1" w:styleId="NomDeCoursCar">
     <w:name w:val="NomDeCours Car"/>
-    <w:basedOn w:val="DefaultParagraphFont"/>
+    <w:basedOn w:val="Policepardfaut"/>
     <w:link w:val="NomDeCours"/>
     <w:rsid w:val="00390E7D"/>
     <w:rPr>
@@ -1224,7 +1224,7 @@
   </w:style>
   <w:style w:type="character" w:customStyle="1" w:styleId="RponseCourteCar">
     <w:name w:val="RéponseCourte Car"/>
-    <w:basedOn w:val="DefaultParagraphFont"/>
+    <w:basedOn w:val="Policepardfaut"/>
     <w:link w:val="RponseCourte"/>
     <w:rsid w:val="00390E7D"/>
     <w:rPr>
@@ -1254,7 +1254,7 @@
   </w:style>
   <w:style w:type="character" w:customStyle="1" w:styleId="TitreDevoirCar">
     <w:name w:val="TitreDevoir Car"/>
-    <w:basedOn w:val="DefaultParagraphFont"/>
+    <w:basedOn w:val="Policepardfaut"/>
     <w:link w:val="TitreDevoir"/>
     <w:rsid w:val="00390E7D"/>
     <w:rPr>
@@ -1284,7 +1284,7 @@
   </w:style>
   <w:style w:type="character" w:customStyle="1" w:styleId="DevoirTitreSection2Car">
     <w:name w:val="DevoirTitreSection2 Car"/>
-    <w:basedOn w:val="DefaultParagraphFont"/>
+    <w:basedOn w:val="Policepardfaut"/>
     <w:link w:val="DevoirTitreSection2"/>
     <w:rsid w:val="00363CD2"/>
     <w:rPr>
@@ -1312,7 +1312,7 @@
   </w:style>
   <w:style w:type="character" w:customStyle="1" w:styleId="PondrationElemetnCar">
     <w:name w:val="PondérationElemetn Car"/>
-    <w:basedOn w:val="DefaultParagraphFont"/>
+    <w:basedOn w:val="Policepardfaut"/>
     <w:link w:val="PondrationElemetn"/>
     <w:rsid w:val="000A7E05"/>
   </w:style>
@@ -1335,7 +1335,7 @@
   </w:style>
   <w:style w:type="character" w:customStyle="1" w:styleId="PonderationSousElementCar">
     <w:name w:val="PonderationSousElement Car"/>
-    <w:basedOn w:val="DefaultParagraphFont"/>
+    <w:basedOn w:val="Policepardfaut"/>
     <w:link w:val="PonderationSousElement"/>
     <w:rsid w:val="000A7E05"/>
   </w:style>
@@ -1357,7 +1357,7 @@
   </w:style>
   <w:style w:type="character" w:customStyle="1" w:styleId="DureeDuTravailCar">
     <w:name w:val="DureeDuTravail Car"/>
-    <w:basedOn w:val="DefaultParagraphFont"/>
+    <w:basedOn w:val="Policepardfaut"/>
     <w:link w:val="DureeDuTravail"/>
     <w:rsid w:val="00324601"/>
     <w:rPr>
@@ -1380,7 +1380,7 @@
   </w:style>
   <w:style w:type="character" w:customStyle="1" w:styleId="TitreDeTravailCar">
     <w:name w:val="TitreDeTravail Car"/>
-    <w:basedOn w:val="DefaultParagraphFont"/>
+    <w:basedOn w:val="Policepardfaut"/>
     <w:link w:val="TitreDeTravail"/>
     <w:rsid w:val="00324601"/>
     <w:rPr>
@@ -1415,7 +1415,7 @@
   </w:style>
   <w:style w:type="character" w:customStyle="1" w:styleId="code-blockCar">
     <w:name w:val="code-block Car"/>
-    <w:basedOn w:val="DefaultParagraphFont"/>
+    <w:basedOn w:val="Policepardfaut"/>
     <w:link w:val="code-block"/>
     <w:rsid w:val="00184443"/>
     <w:rPr>
@@ -1456,7 +1456,7 @@
   </w:style>
   <w:style w:type="paragraph" w:customStyle="1" w:styleId="code-titre">
     <w:name w:val="code-titre"/>
-    <w:basedOn w:val="Heading2"/>
+    <w:basedOn w:val="Titre2"/>
     <w:link w:val="code-titreCar"/>
     <w:qFormat/>
     <w:rsid w:val="00184443"/>
@@ -1482,7 +1482,7 @@
   </w:style>
   <w:style w:type="character" w:customStyle="1" w:styleId="code-titreCar">
     <w:name w:val="code-titre Car"/>
-    <w:basedOn w:val="Heading2Char"/>
+    <w:basedOn w:val="Titre2Car"/>
     <w:link w:val="code-titre"/>
     <w:rsid w:val="00184443"/>
     <w:rPr>
@@ -1496,10 +1496,10 @@
       <w14:ligatures w14:val="none"/>
     </w:rPr>
   </w:style>
-  <w:style w:type="character" w:customStyle="1" w:styleId="Heading2Char">
-    <w:name w:val="Heading 2 Char"/>
-    <w:basedOn w:val="DefaultParagraphFont"/>
-    <w:link w:val="Heading2"/>
+  <w:style w:type="character" w:customStyle="1" w:styleId="Titre2Car">
+    <w:name w:val="Titre 2 Car"/>
+    <w:basedOn w:val="Policepardfaut"/>
+    <w:link w:val="Titre2"/>
     <w:uiPriority w:val="9"/>
     <w:semiHidden/>
     <w:rsid w:val="00184443"/>
@@ -1530,7 +1530,7 @@
   </w:style>
   <w:style w:type="character" w:customStyle="1" w:styleId="inline-code-emCar">
     <w:name w:val="inline-code-em Car"/>
-    <w:basedOn w:val="DefaultParagraphFont"/>
+    <w:basedOn w:val="Policepardfaut"/>
     <w:link w:val="inline-code-em"/>
     <w:rsid w:val="00184443"/>
     <w:rPr>
@@ -1542,10 +1542,10 @@
       <w14:ligatures w14:val="none"/>
     </w:rPr>
   </w:style>
-  <w:style w:type="character" w:customStyle="1" w:styleId="Heading1Char">
-    <w:name w:val="Heading 1 Char"/>
-    <w:basedOn w:val="DefaultParagraphFont"/>
-    <w:link w:val="Heading1"/>
+  <w:style w:type="character" w:customStyle="1" w:styleId="Titre1Car">
+    <w:name w:val="Titre 1 Car"/>
+    <w:basedOn w:val="Policepardfaut"/>
+    <w:link w:val="Titre1"/>
     <w:uiPriority w:val="9"/>
     <w:rsid w:val="003B67C5"/>
     <w:rPr>
@@ -1555,10 +1555,10 @@
       <w:szCs w:val="40"/>
     </w:rPr>
   </w:style>
-  <w:style w:type="character" w:customStyle="1" w:styleId="Heading3Char">
-    <w:name w:val="Heading 3 Char"/>
-    <w:basedOn w:val="DefaultParagraphFont"/>
-    <w:link w:val="Heading3"/>
+  <w:style w:type="character" w:customStyle="1" w:styleId="Titre3Car">
+    <w:name w:val="Titre 3 Car"/>
+    <w:basedOn w:val="Policepardfaut"/>
+    <w:link w:val="Titre3"/>
     <w:uiPriority w:val="9"/>
     <w:semiHidden/>
     <w:rsid w:val="003B67C5"/>
@@ -1569,10 +1569,10 @@
       <w:szCs w:val="28"/>
     </w:rPr>
   </w:style>
-  <w:style w:type="character" w:customStyle="1" w:styleId="Heading4Char">
-    <w:name w:val="Heading 4 Char"/>
-    <w:basedOn w:val="DefaultParagraphFont"/>
-    <w:link w:val="Heading4"/>
+  <w:style w:type="character" w:customStyle="1" w:styleId="Titre4Car">
+    <w:name w:val="Titre 4 Car"/>
+    <w:basedOn w:val="Policepardfaut"/>
+    <w:link w:val="Titre4"/>
     <w:uiPriority w:val="9"/>
     <w:semiHidden/>
     <w:rsid w:val="003B67C5"/>
@@ -1583,10 +1583,10 @@
       <w:color w:val="0F4761" w:themeColor="accent1" w:themeShade="BF"/>
     </w:rPr>
   </w:style>
-  <w:style w:type="character" w:customStyle="1" w:styleId="Heading5Char">
-    <w:name w:val="Heading 5 Char"/>
-    <w:basedOn w:val="DefaultParagraphFont"/>
-    <w:link w:val="Heading5"/>
+  <w:style w:type="character" w:customStyle="1" w:styleId="Titre5Car">
+    <w:name w:val="Titre 5 Car"/>
+    <w:basedOn w:val="Policepardfaut"/>
+    <w:link w:val="Titre5"/>
     <w:uiPriority w:val="9"/>
     <w:semiHidden/>
     <w:rsid w:val="003B67C5"/>
@@ -1595,10 +1595,10 @@
       <w:color w:val="0F4761" w:themeColor="accent1" w:themeShade="BF"/>
     </w:rPr>
   </w:style>
-  <w:style w:type="character" w:customStyle="1" w:styleId="Heading6Char">
-    <w:name w:val="Heading 6 Char"/>
-    <w:basedOn w:val="DefaultParagraphFont"/>
-    <w:link w:val="Heading6"/>
+  <w:style w:type="character" w:customStyle="1" w:styleId="Titre6Car">
+    <w:name w:val="Titre 6 Car"/>
+    <w:basedOn w:val="Policepardfaut"/>
+    <w:link w:val="Titre6"/>
     <w:uiPriority w:val="9"/>
     <w:semiHidden/>
     <w:rsid w:val="003B67C5"/>
@@ -1609,10 +1609,10 @@
       <w:color w:val="595959" w:themeColor="text1" w:themeTint="A6"/>
     </w:rPr>
   </w:style>
-  <w:style w:type="character" w:customStyle="1" w:styleId="Heading7Char">
-    <w:name w:val="Heading 7 Char"/>
-    <w:basedOn w:val="DefaultParagraphFont"/>
-    <w:link w:val="Heading7"/>
+  <w:style w:type="character" w:customStyle="1" w:styleId="Titre7Car">
+    <w:name w:val="Titre 7 Car"/>
+    <w:basedOn w:val="Policepardfaut"/>
+    <w:link w:val="Titre7"/>
     <w:uiPriority w:val="9"/>
     <w:semiHidden/>
     <w:rsid w:val="003B67C5"/>
@@ -1621,10 +1621,10 @@
       <w:color w:val="595959" w:themeColor="text1" w:themeTint="A6"/>
     </w:rPr>
   </w:style>
-  <w:style w:type="character" w:customStyle="1" w:styleId="Heading8Char">
-    <w:name w:val="Heading 8 Char"/>
-    <w:basedOn w:val="DefaultParagraphFont"/>
-    <w:link w:val="Heading8"/>
+  <w:style w:type="character" w:customStyle="1" w:styleId="Titre8Car">
+    <w:name w:val="Titre 8 Car"/>
+    <w:basedOn w:val="Policepardfaut"/>
+    <w:link w:val="Titre8"/>
     <w:uiPriority w:val="9"/>
     <w:semiHidden/>
     <w:rsid w:val="003B67C5"/>
@@ -1635,10 +1635,10 @@
       <w:color w:val="272727" w:themeColor="text1" w:themeTint="D8"/>
     </w:rPr>
   </w:style>
-  <w:style w:type="character" w:customStyle="1" w:styleId="Heading9Char">
-    <w:name w:val="Heading 9 Char"/>
-    <w:basedOn w:val="DefaultParagraphFont"/>
-    <w:link w:val="Heading9"/>
+  <w:style w:type="character" w:customStyle="1" w:styleId="Titre9Car">
+    <w:name w:val="Titre 9 Car"/>
+    <w:basedOn w:val="Policepardfaut"/>
+    <w:link w:val="Titre9"/>
     <w:uiPriority w:val="9"/>
     <w:semiHidden/>
     <w:rsid w:val="003B67C5"/>
@@ -1647,11 +1647,11 @@
       <w:color w:val="272727" w:themeColor="text1" w:themeTint="D8"/>
     </w:rPr>
   </w:style>
-  <w:style w:type="paragraph" w:styleId="Title">
+  <w:style w:type="paragraph" w:styleId="Titre">
     <w:name w:val="Title"/>
     <w:basedOn w:val="Normal"/>
     <w:next w:val="Normal"/>
-    <w:link w:val="TitleChar"/>
+    <w:link w:val="TitreCar"/>
     <w:uiPriority w:val="10"/>
     <w:qFormat/>
     <w:rsid w:val="003B67C5"/>
@@ -1667,10 +1667,10 @@
       <w:szCs w:val="56"/>
     </w:rPr>
   </w:style>
-  <w:style w:type="character" w:customStyle="1" w:styleId="TitleChar">
-    <w:name w:val="Title Char"/>
-    <w:basedOn w:val="DefaultParagraphFont"/>
-    <w:link w:val="Title"/>
+  <w:style w:type="character" w:customStyle="1" w:styleId="TitreCar">
+    <w:name w:val="Titre Car"/>
+    <w:basedOn w:val="Policepardfaut"/>
+    <w:link w:val="Titre"/>
     <w:uiPriority w:val="10"/>
     <w:rsid w:val="003B67C5"/>
     <w:rPr>
@@ -1681,11 +1681,11 @@
       <w:szCs w:val="56"/>
     </w:rPr>
   </w:style>
-  <w:style w:type="paragraph" w:styleId="Subtitle">
+  <w:style w:type="paragraph" w:styleId="Sous-titre">
     <w:name w:val="Subtitle"/>
     <w:basedOn w:val="Normal"/>
     <w:next w:val="Normal"/>
-    <w:link w:val="SubtitleChar"/>
+    <w:link w:val="Sous-titreCar"/>
     <w:uiPriority w:val="11"/>
     <w:qFormat/>
     <w:rsid w:val="003B67C5"/>
@@ -1702,10 +1702,10 @@
       <w:szCs w:val="28"/>
     </w:rPr>
   </w:style>
-  <w:style w:type="character" w:customStyle="1" w:styleId="SubtitleChar">
-    <w:name w:val="Subtitle Char"/>
-    <w:basedOn w:val="DefaultParagraphFont"/>
-    <w:link w:val="Subtitle"/>
+  <w:style w:type="character" w:customStyle="1" w:styleId="Sous-titreCar">
+    <w:name w:val="Sous-titre Car"/>
+    <w:basedOn w:val="Policepardfaut"/>
+    <w:link w:val="Sous-titre"/>
     <w:uiPriority w:val="11"/>
     <w:rsid w:val="003B67C5"/>
     <w:rPr>
@@ -1716,11 +1716,11 @@
       <w:szCs w:val="28"/>
     </w:rPr>
   </w:style>
-  <w:style w:type="paragraph" w:styleId="Quote">
+  <w:style w:type="paragraph" w:styleId="Citation">
     <w:name w:val="Quote"/>
     <w:basedOn w:val="Normal"/>
     <w:next w:val="Normal"/>
-    <w:link w:val="QuoteChar"/>
+    <w:link w:val="CitationCar"/>
     <w:uiPriority w:val="29"/>
     <w:qFormat/>
     <w:rsid w:val="003B67C5"/>
@@ -1734,10 +1734,10 @@
       <w:color w:val="404040" w:themeColor="text1" w:themeTint="BF"/>
     </w:rPr>
   </w:style>
-  <w:style w:type="character" w:customStyle="1" w:styleId="QuoteChar">
-    <w:name w:val="Quote Char"/>
-    <w:basedOn w:val="DefaultParagraphFont"/>
-    <w:link w:val="Quote"/>
+  <w:style w:type="character" w:customStyle="1" w:styleId="CitationCar">
+    <w:name w:val="Citation Car"/>
+    <w:basedOn w:val="Policepardfaut"/>
+    <w:link w:val="Citation"/>
     <w:uiPriority w:val="29"/>
     <w:rsid w:val="003B67C5"/>
     <w:rPr>
@@ -1747,7 +1747,7 @@
       <w:color w:val="404040" w:themeColor="text1" w:themeTint="BF"/>
     </w:rPr>
   </w:style>
-  <w:style w:type="paragraph" w:styleId="ListParagraph">
+  <w:style w:type="paragraph" w:styleId="Paragraphedeliste">
     <w:name w:val="List Paragraph"/>
     <w:basedOn w:val="Normal"/>
     <w:uiPriority w:val="34"/>
@@ -1758,9 +1758,9 @@
       <w:contextualSpacing/>
     </w:pPr>
   </w:style>
-  <w:style w:type="character" w:styleId="IntenseEmphasis">
+  <w:style w:type="character" w:styleId="Accentuationintense">
     <w:name w:val="Intense Emphasis"/>
-    <w:basedOn w:val="DefaultParagraphFont"/>
+    <w:basedOn w:val="Policepardfaut"/>
     <w:uiPriority w:val="21"/>
     <w:qFormat/>
     <w:rsid w:val="003B67C5"/>
@@ -1770,11 +1770,11 @@
       <w:color w:val="0F4761" w:themeColor="accent1" w:themeShade="BF"/>
     </w:rPr>
   </w:style>
-  <w:style w:type="paragraph" w:styleId="IntenseQuote">
+  <w:style w:type="paragraph" w:styleId="Citationintense">
     <w:name w:val="Intense Quote"/>
     <w:basedOn w:val="Normal"/>
     <w:next w:val="Normal"/>
-    <w:link w:val="IntenseQuoteChar"/>
+    <w:link w:val="CitationintenseCar"/>
     <w:uiPriority w:val="30"/>
     <w:qFormat/>
     <w:rsid w:val="003B67C5"/>
@@ -1793,10 +1793,10 @@
       <w:color w:val="0F4761" w:themeColor="accent1" w:themeShade="BF"/>
     </w:rPr>
   </w:style>
-  <w:style w:type="character" w:customStyle="1" w:styleId="IntenseQuoteChar">
-    <w:name w:val="Intense Quote Char"/>
-    <w:basedOn w:val="DefaultParagraphFont"/>
-    <w:link w:val="IntenseQuote"/>
+  <w:style w:type="character" w:customStyle="1" w:styleId="CitationintenseCar">
+    <w:name w:val="Citation intense Car"/>
+    <w:basedOn w:val="Policepardfaut"/>
+    <w:link w:val="Citationintense"/>
     <w:uiPriority w:val="30"/>
     <w:rsid w:val="003B67C5"/>
     <w:rPr>
@@ -1806,9 +1806,9 @@
       <w:color w:val="0F4761" w:themeColor="accent1" w:themeShade="BF"/>
     </w:rPr>
   </w:style>
-  <w:style w:type="character" w:styleId="IntenseReference">
+  <w:style w:type="character" w:styleId="Rfrenceintense">
     <w:name w:val="Intense Reference"/>
-    <w:basedOn w:val="DefaultParagraphFont"/>
+    <w:basedOn w:val="Policepardfaut"/>
     <w:uiPriority w:val="32"/>
     <w:qFormat/>
     <w:rsid w:val="003B67C5"/>
@@ -1820,9 +1820,9 @@
       <w:spacing w:val="5"/>
     </w:rPr>
   </w:style>
-  <w:style w:type="character" w:styleId="Hyperlink">
+  <w:style w:type="character" w:styleId="Lienhypertexte">
     <w:name w:val="Hyperlink"/>
-    <w:basedOn w:val="DefaultParagraphFont"/>
+    <w:basedOn w:val="Policepardfaut"/>
     <w:uiPriority w:val="99"/>
     <w:unhideWhenUsed/>
     <w:rsid w:val="00C604FE"/>
@@ -1831,9 +1831,9 @@
       <w:u w:val="single"/>
     </w:rPr>
   </w:style>
-  <w:style w:type="character" w:styleId="UnresolvedMention">
+  <w:style w:type="character" w:styleId="Mentionnonrsolue">
     <w:name w:val="Unresolved Mention"/>
-    <w:basedOn w:val="DefaultParagraphFont"/>
+    <w:basedOn w:val="Policepardfaut"/>
     <w:uiPriority w:val="99"/>
     <w:semiHidden/>
     <w:unhideWhenUsed/>
@@ -1843,9 +1843,9 @@
       <w:shd w:val="clear" w:color="auto" w:fill="E1DFDD"/>
     </w:rPr>
   </w:style>
-  <w:style w:type="character" w:styleId="FollowedHyperlink">
+  <w:style w:type="character" w:styleId="Lienhypertextesuivivisit">
     <w:name w:val="FollowedHyperlink"/>
-    <w:basedOn w:val="DefaultParagraphFont"/>
+    <w:basedOn w:val="Policepardfaut"/>
     <w:uiPriority w:val="99"/>
     <w:semiHidden/>
     <w:unhideWhenUsed/>

</xml_diff>